<commit_message>
docs: update Word deployment manuals
</commit_message>
<xml_diff>
--- a/docs/03-后端实施文档.docx
+++ b/docs/03-后端实施文档.docx
@@ -1222,6 +1222,211 @@
           <w:rFonts w:ascii="Times New Roman" w:eastAsia="SimSun"/>
         </w:rPr>
         <w:t xml:space="preserve">预计耗时：3~4 小时（不含传输释放）。已在内网服务器（sapgls4dev / client 470）实测完成。</w:t>
+      </w:r>
+    </w:p>
+    <w:p>
+      <w:pPr>
+        <w:pStyle w:val="Heading1"/>
+        <w:keepNext/>
+        <w:spacing w:after="80"/>
+      </w:pPr>
+      <w:r>
+        <w:rPr>
+          <w:rFonts w:ascii="Hiragino Sans GB W3" w:hAnsi="Hiragino Sans GB W3" w:eastAsia="Hiragino Sans GB W3"/>
+          <w:b/>
+          <w:highlight w:val="yellow"/>
+        </w:rPr>
+        <w:t>本次增量部署（2026-10-05）</w:t>
+      </w:r>
+    </w:p>
+    <w:p>
+      <w:pPr>
+        <w:spacing w:after="80"/>
+      </w:pPr>
+      <w:r>
+        <w:rPr>
+          <w:rFonts w:ascii="Hiragino Sans GB W3" w:hAnsi="Hiragino Sans GB W3" w:eastAsia="Hiragino Sans GB W3"/>
+          <w:b/>
+          <w:highlight w:val="yellow"/>
+        </w:rPr>
+        <w:t>黄色高亮内容是本次动态 SQL 和安全修复的新增部署项。先完成本节，再沿用后文原有的建表、SEGW、SE24、SM59、SICF 和传输流程。</w:t>
+      </w:r>
+    </w:p>
+    <w:p>
+      <w:pPr>
+        <w:pStyle w:val="Heading2"/>
+        <w:keepNext/>
+        <w:spacing w:after="80"/>
+      </w:pPr>
+      <w:r>
+        <w:rPr>
+          <w:rFonts w:ascii="Hiragino Sans GB W3" w:hAnsi="Hiragino Sans GB W3" w:eastAsia="Hiragino Sans GB W3"/>
+          <w:b/>
+          <w:highlight w:val="yellow"/>
+        </w:rPr>
+        <w:t>部署前基线</w:t>
+      </w:r>
+    </w:p>
+    <w:p>
+      <w:pPr>
+        <w:spacing w:after="80"/>
+      </w:pPr>
+      <w:r>
+        <w:rPr>
+          <w:rFonts w:ascii="Hiragino Sans GB W3" w:hAnsi="Hiragino Sans GB W3" w:eastAsia="Hiragino Sans GB W3"/>
+          <w:b w:val="0"/>
+          <w:highlight w:val="yellow"/>
+        </w:rPr>
+        <w:t>当前测试基线为 SAP_BASIS 755。动态 SQL 复用现有 ZAI_CHAT_SRV 和 AnalyzeAgent，一般不需要新建 SEGW Entity 或 Function Import；只有 OData 元数据发生变化时才重新生成运行时。</w:t>
+      </w:r>
+    </w:p>
+    <w:p>
+      <w:pPr>
+        <w:spacing w:after="80"/>
+      </w:pPr>
+      <w:r>
+        <w:rPr>
+          <w:rFonts w:ascii="Hiragino Sans GB W3" w:hAnsi="Hiragino Sans GB W3" w:eastAsia="Hiragino Sans GB W3"/>
+          <w:b w:val="0"/>
+          <w:highlight w:val="yellow"/>
+        </w:rPr>
+        <w:t>ICM、Web Dispatcher 和反向代理的超时建议统一不低于 200 秒，避免 SQL 分析或多轮 Agent 请求被中途断开。</w:t>
+      </w:r>
+    </w:p>
+    <w:p>
+      <w:pPr>
+        <w:pStyle w:val="Heading2"/>
+        <w:keepNext/>
+        <w:spacing w:after="80"/>
+      </w:pPr>
+      <w:r>
+        <w:rPr>
+          <w:rFonts w:ascii="Hiragino Sans GB W3" w:hAnsi="Hiragino Sans GB W3" w:eastAsia="Hiragino Sans GB W3"/>
+          <w:b/>
+          <w:highlight w:val="yellow"/>
+        </w:rPr>
+        <w:t>ABAP 对象变更</w:t>
+      </w:r>
+    </w:p>
+    <w:p>
+      <w:pPr>
+        <w:spacing w:after="80"/>
+      </w:pPr>
+      <w:r>
+        <w:rPr>
+          <w:rFonts w:ascii="Hiragino Sans GB W3" w:hAnsi="Hiragino Sans GB W3" w:eastAsia="Hiragino Sans GB W3"/>
+          <w:b w:val="0"/>
+          <w:highlight w:val="yellow"/>
+        </w:rPr>
+        <w:t>新增类：ZCL_AI_SQL_GUARD、ZCL_AI_SQL_EXECUTOR、ZCL_AI_DDIC_TOOLS。</w:t>
+      </w:r>
+    </w:p>
+    <w:p>
+      <w:pPr>
+        <w:spacing w:after="80"/>
+      </w:pPr>
+      <w:r>
+        <w:rPr>
+          <w:rFonts w:ascii="Hiragino Sans GB W3" w:hAnsi="Hiragino Sans GB W3" w:eastAsia="Hiragino Sans GB W3"/>
+          <w:b w:val="0"/>
+          <w:highlight w:val="yellow"/>
+        </w:rPr>
+        <w:t>覆盖类：ZCL_AI_TOOL_REGISTRY、ZCL_AI_AGENT_GUARD、ZCL_AI_DOMAIN_CARDS、ZCL_AI_AGENT_SERVICE、ZCL_AI_CHAT_SERVICE、ZCL_AI_CODE_PROVIDER、ZCL_ZAI_CHAT_DPC_EXT、ZCL_AI_DATA_ANALYSIS_SERVICE。</w:t>
+      </w:r>
+    </w:p>
+    <w:p>
+      <w:pPr>
+        <w:spacing w:after="80"/>
+      </w:pPr>
+      <w:r>
+        <w:rPr>
+          <w:rFonts w:ascii="Hiragino Sans GB W3" w:hAnsi="Hiragino Sans GB W3" w:eastAsia="Hiragino Sans GB W3"/>
+          <w:b w:val="0"/>
+          <w:highlight w:val="yellow"/>
+        </w:rPr>
+        <w:t>激活顺序：SQL_GUARD → SQL_EXECUTOR → DDIC_TOOLS → TOOL_REGISTRY → AGENT_GUARD → DOMAIN_CARDS → AGENT_SERVICE → CHAT_SERVICE → CODE_PROVIDER → ZAI_CHAT_DPC_EXT → DATA_ANALYSIS_SERVICE。</w:t>
+      </w:r>
+    </w:p>
+    <w:p>
+      <w:pPr>
+        <w:pStyle w:val="Heading2"/>
+        <w:keepNext/>
+        <w:spacing w:after="80"/>
+      </w:pPr>
+      <w:r>
+        <w:rPr>
+          <w:rFonts w:ascii="Hiragino Sans GB W3" w:hAnsi="Hiragino Sans GB W3" w:eastAsia="Hiragino Sans GB W3"/>
+          <w:b/>
+          <w:highlight w:val="yellow"/>
+        </w:rPr>
+        <w:t>数据库与配置</w:t>
+      </w:r>
+    </w:p>
+    <w:p>
+      <w:pPr>
+        <w:spacing w:after="80"/>
+      </w:pPr>
+      <w:r>
+        <w:rPr>
+          <w:rFonts w:ascii="Hiragino Sans GB W3" w:hAnsi="Hiragino Sans GB W3" w:eastAsia="Hiragino Sans GB W3"/>
+          <w:b w:val="0"/>
+          <w:highlight w:val="yellow"/>
+        </w:rPr>
+        <w:t>新增表 ZAI_SQL_LOG：QUERY_ID CHAR40（主键）、USERNAME CHAR12、SQL_TEXT STRING、STATUS CHAR10（OK/ERROR/REJECTED）、RESULT_ROWS INT4、ERROR_MSG STRING、SESSION_ID CHAR40、CREATED_AT CHAR14。</w:t>
+      </w:r>
+    </w:p>
+    <w:p>
+      <w:pPr>
+        <w:spacing w:after="80"/>
+      </w:pPr>
+      <w:r>
+        <w:rPr>
+          <w:rFonts w:ascii="Hiragino Sans GB W3" w:hAnsi="Hiragino Sans GB W3" w:eastAsia="Hiragino Sans GB W3"/>
+          <w:b w:val="0"/>
+          <w:highlight w:val="yellow"/>
+        </w:rPr>
+        <w:t>ZAI_CHAT_CFG 建议值：SQL_ANALYSIS_ENABLED=X、SQL_MAX_ROWS=5000、SQL_MAX_EXEC=5、AGENT_MAX_ROUNDS=10、AGENT_BUDGET_SEC=180。</w:t>
+      </w:r>
+    </w:p>
+    <w:p>
+      <w:pPr>
+        <w:spacing w:after="80"/>
+      </w:pPr>
+      <w:r>
+        <w:rPr>
+          <w:rFonts w:ascii="Hiragino Sans GB W3" w:hAnsi="Hiragino Sans GB W3" w:eastAsia="Hiragino Sans GB W3"/>
+          <w:b w:val="0"/>
+          <w:highlight w:val="yellow"/>
+        </w:rPr>
+        <w:t>可选增加 ZAI_CHAT_USER-SQL_ALLOWED CHAR1。登录用户字段使用 USERID，不要误写成 USERNAME。</w:t>
+      </w:r>
+    </w:p>
+    <w:p>
+      <w:pPr>
+        <w:pStyle w:val="Heading2"/>
+        <w:keepNext/>
+        <w:spacing w:after="80"/>
+      </w:pPr>
+      <w:r>
+        <w:rPr>
+          <w:rFonts w:ascii="Hiragino Sans GB W3" w:hAnsi="Hiragino Sans GB W3" w:eastAsia="Hiragino Sans GB W3"/>
+          <w:b/>
+          <w:highlight w:val="yellow"/>
+        </w:rPr>
+        <w:t>动态 SQL 验收</w:t>
+      </w:r>
+    </w:p>
+    <w:p>
+      <w:pPr>
+        <w:spacing w:after="80"/>
+      </w:pPr>
+      <w:r>
+        <w:rPr>
+          <w:rFonts w:ascii="Hiragino Sans GB W3" w:hAnsi="Hiragino Sans GB W3" w:eastAsia="Hiragino Sans GB W3"/>
+          <w:b w:val="0"/>
+          <w:highlight w:val="yellow"/>
+        </w:rPr>
+        <w:t>先验证 SQL_ANALYSIS_ENABLED 开关；再执行表搜索、描述 VBAK、描述后运行 SQL，并用自建表 ZIDPPP_TEST01 做分组分析。未描述的表应被拒绝，DELETE、UPDATE、USR02 等高风险操作应被拒绝，ZAI_SQL_LOG 应记录 OK、ERROR 和 REJECTED 结果。</w:t>
       </w:r>
     </w:p>
     <w:p>

</xml_diff>